<commit_message>
Make figure attribution explicit in the manual
Each of the 6 diagrams now states in its caption that it is original
work ("elaboração própria") produced for this manual, together with
the reference(s) whose technical description it illustrates, per the
kept-original-diagrams option (avoids reproducing copyrighted journal
figures without publisher permission).

Co-Authored-By: Claude Sonnet 5 <noreply@anthropic.com>
Claude-Session: https://claude.ai/code/session_012qbpeUvFi7qyCkjneWmB6Y
</commit_message>
<xml_diff>
--- a/Manual_Kinesio_Taping_Cirurgias_Faciais.docx
+++ b/Manual_Kinesio_Taping_Cirurgias_Faciais.docx
@@ -863,6 +863,35 @@
         </w:rPr>
         <w:t xml:space="preserve">Figura 1 — Estações linfáticas funcionais usadas como referência para a orientação das tiras.</w:t>
       </w:r>
+      <w:r>
+        <w:rPr>
+          <w:sz w:val="18"/>
+          <w:szCs w:val="18"/>
+        </w:rPr>
+        <w:t xml:space="preserve">  </w:t>
+      </w:r>
+      <w:r>
+        <w:rPr>
+          <w:b/>
+          <w:bCs/>
+          <w:i/>
+          <w:iCs/>
+          <w:color w:val="5b6472"/>
+          <w:sz w:val="18"/>
+          <w:szCs w:val="18"/>
+        </w:rPr>
+        <w:t xml:space="preserve">Elaboração própria — </w:t>
+      </w:r>
+      <w:r>
+        <w:rPr>
+          <w:i/>
+          <w:iCs/>
+          <w:color w:val="5b6472"/>
+          <w:sz w:val="18"/>
+          <w:szCs w:val="18"/>
+        </w:rPr>
+        <w:t xml:space="preserve">esquema didático simplificado, elaborado para este manual com base nos dados técnicos de Correa et al., 2021 [1]; Cunha et al., 2024 [2]; Hörmann et al., 2020 [3].</w:t>
+      </w:r>
     </w:p>
     <w:p>
       <w:pPr>
@@ -1728,6 +1757,35 @@
         </w:rPr>
         <w:t xml:space="preserve">Figura 2 — Zonas de tensão da técnica em "leque": base sem tensão, corpo com tensão moderada, cauda distal quase sem tensão.</w:t>
       </w:r>
+      <w:r>
+        <w:rPr>
+          <w:sz w:val="18"/>
+          <w:szCs w:val="18"/>
+        </w:rPr>
+        <w:t xml:space="preserve">  </w:t>
+      </w:r>
+      <w:r>
+        <w:rPr>
+          <w:b/>
+          <w:bCs/>
+          <w:i/>
+          <w:iCs/>
+          <w:color w:val="5b6472"/>
+          <w:sz w:val="18"/>
+          <w:szCs w:val="18"/>
+        </w:rPr>
+        <w:t xml:space="preserve">Elaboração própria — </w:t>
+      </w:r>
+      <w:r>
+        <w:rPr>
+          <w:i/>
+          <w:iCs/>
+          <w:color w:val="5b6472"/>
+          <w:sz w:val="18"/>
+          <w:szCs w:val="18"/>
+        </w:rPr>
+        <w:t xml:space="preserve">esquema didático elaborado para este manual, ilustrando os princípios gerais de aplicação descritos em [1,2,5,9].</w:t>
+      </w:r>
     </w:p>
     <w:p>
       <w:pPr>
@@ -2094,6 +2152,35 @@
         </w:rPr>
         <w:t xml:space="preserve">Figura 3 — Técnica em “polvo” para blefaroplastia: base fixa lateral ao olho, 2 tiras finas para a pálpebra superior e 1 tira larga para a pálpebra inferior.</w:t>
       </w:r>
+      <w:r>
+        <w:rPr>
+          <w:sz w:val="18"/>
+          <w:szCs w:val="18"/>
+        </w:rPr>
+        <w:t xml:space="preserve">  </w:t>
+      </w:r>
+      <w:r>
+        <w:rPr>
+          <w:b/>
+          <w:bCs/>
+          <w:i/>
+          <w:iCs/>
+          <w:color w:val="5b6472"/>
+          <w:sz w:val="18"/>
+          <w:szCs w:val="18"/>
+        </w:rPr>
+        <w:t xml:space="preserve">Elaboração própria — </w:t>
+      </w:r>
+      <w:r>
+        <w:rPr>
+          <w:i/>
+          <w:iCs/>
+          <w:color w:val="5b6472"/>
+          <w:sz w:val="18"/>
+          <w:szCs w:val="18"/>
+        </w:rPr>
+        <w:t xml:space="preserve">esquema didático elaborado para este manual, reproduzindo o protocolo textual descrito por Cunha, Rolim, Ribeiro &amp; Alencar, EdUnichristus, 2024 [2].</w:t>
+      </w:r>
     </w:p>
     <w:p>
       <w:pPr>
@@ -2520,6 +2607,35 @@
         </w:rPr>
         <w:t xml:space="preserve">Figura 4 — Proposta extrapolada para ritidoplastia: âncoras nos linfonodos pré-auricular, submandibular e cervical superior; tiras acompanham o retalho descolado, sem tracionar sobre a incisão.</w:t>
       </w:r>
+      <w:r>
+        <w:rPr>
+          <w:sz w:val="18"/>
+          <w:szCs w:val="18"/>
+        </w:rPr>
+        <w:t xml:space="preserve">  </w:t>
+      </w:r>
+      <w:r>
+        <w:rPr>
+          <w:b/>
+          <w:bCs/>
+          <w:i/>
+          <w:iCs/>
+          <w:color w:val="5b6472"/>
+          <w:sz w:val="18"/>
+          <w:szCs w:val="18"/>
+        </w:rPr>
+        <w:t xml:space="preserve">Elaboração própria — </w:t>
+      </w:r>
+      <w:r>
+        <w:rPr>
+          <w:i/>
+          <w:iCs/>
+          <w:color w:val="5b6472"/>
+          <w:sz w:val="18"/>
+          <w:szCs w:val="18"/>
+        </w:rPr>
+        <w:t xml:space="preserve">esquema didático elaborado para este manual; proposta extrapolada a partir de fraturas faciais [4], cirurgia ortognática [5,6] e bichectomia [8] — sem RCT direto em ritidoplastia (ver 6.1).</w:t>
+      </w:r>
     </w:p>
     <w:p>
       <w:pPr>
@@ -2839,6 +2955,35 @@
         </w:rPr>
         <w:t xml:space="preserve">Figura 5 — Os dois usos de “fita” no lifting temporal não devem ser confundidos: fixação estrutural (esquerda) versus bandagem antiedema (direita).</w:t>
       </w:r>
+      <w:r>
+        <w:rPr>
+          <w:sz w:val="18"/>
+          <w:szCs w:val="18"/>
+        </w:rPr>
+        <w:t xml:space="preserve">  </w:t>
+      </w:r>
+      <w:r>
+        <w:rPr>
+          <w:b/>
+          <w:bCs/>
+          <w:i/>
+          <w:iCs/>
+          <w:color w:val="5b6472"/>
+          <w:sz w:val="18"/>
+          <w:szCs w:val="18"/>
+        </w:rPr>
+        <w:t xml:space="preserve">Elaboração própria — </w:t>
+      </w:r>
+      <w:r>
+        <w:rPr>
+          <w:i/>
+          <w:iCs/>
+          <w:color w:val="5b6472"/>
+          <w:sz w:val="18"/>
+          <w:szCs w:val="18"/>
+        </w:rPr>
+        <w:t xml:space="preserve">esquema didático elaborado para este manual; painel esquerdo baseado no RCT de Haddady-Abianeh et al., 2026 [10], painel direito extrapolado (sem estudo controlado direto — ver 7.1–7.2).</w:t>
+      </w:r>
     </w:p>
     <w:p>
       <w:pPr>
@@ -3180,6 +3325,35 @@
           <w:szCs w:val="18"/>
         </w:rPr>
         <w:t xml:space="preserve">Figura 6 — Lifting de sobrancelha: fita de fixação estrutural (esquerda, RCT direto) versus bandagem antiedema extrapolada (direita).</w:t>
+      </w:r>
+      <w:r>
+        <w:rPr>
+          <w:sz w:val="18"/>
+          <w:szCs w:val="18"/>
+        </w:rPr>
+        <w:t xml:space="preserve">  </w:t>
+      </w:r>
+      <w:r>
+        <w:rPr>
+          <w:b/>
+          <w:bCs/>
+          <w:i/>
+          <w:iCs/>
+          <w:color w:val="5b6472"/>
+          <w:sz w:val="18"/>
+          <w:szCs w:val="18"/>
+        </w:rPr>
+        <w:t xml:space="preserve">Elaboração própria — </w:t>
+      </w:r>
+      <w:r>
+        <w:rPr>
+          <w:i/>
+          <w:iCs/>
+          <w:color w:val="5b6472"/>
+          <w:sz w:val="18"/>
+          <w:szCs w:val="18"/>
+        </w:rPr>
+        <w:t xml:space="preserve">esquema didático elaborado para este manual; painel esquerdo baseado no RCT de Haddady-Abianeh et al., 2026 [10], painel direito extrapolado (sem estudo controlado direto — ver 8.1–8.2).</w:t>
       </w:r>
     </w:p>
     <w:p>

</xml_diff>

<commit_message>
Fix table width bug that broke layout in Google Docs
badge() and calloutBox() tables used WidthType.PERCENTAGE with no
explicit DXA columnWidths/cell widths, which the docx skill flags as
breaking table layout in Google Docs specifically (columns collapse,
forcing text to wrap letter-by-letter — reported as "words coming out
vertical"). Switched both to fixed DXA width matching the page content
area, consistent with the other tables in the document.

Co-Authored-By: Claude Sonnet 5 <noreply@anthropic.com>
Claude-Session: https://claude.ai/code/session_012qbpeUvFi7qyCkjneWmB6Y
</commit_message>
<xml_diff>
--- a/Manual_Kinesio_Taping_Cirurgias_Faciais.docx
+++ b/Manual_Kinesio_Taping_Cirurgias_Faciais.docx
@@ -96,7 +96,7 @@
     </w:p>
     <w:tbl>
       <w:tblPr>
-        <w:tblW w:type="pct" w:w="100%"/>
+        <w:tblW w:type="dxa" w:w="9936"/>
         <w:tblBorders>
           <w:top w:val="single" w:color="33404f" w:sz="6"/>
           <w:left w:val="single" w:color="33404f" w:sz="6"/>
@@ -107,11 +107,12 @@
         </w:tblBorders>
       </w:tblPr>
       <w:tblGrid>
-        <w:gridCol w:w="100"/>
+        <w:gridCol w:w="9936"/>
       </w:tblGrid>
       <w:tr>
         <w:tc>
           <w:tcPr>
+            <w:tcW w:type="dxa" w:w="9936"/>
             <w:shd w:fill="eef1f6" w:val="clear"/>
             <w:tcMar>
               <w:top w:type="dxa" w:w="200"/>
@@ -912,7 +913,7 @@
     </w:p>
     <w:tbl>
       <w:tblPr>
-        <w:tblW w:type="pct" w:w="100%"/>
+        <w:tblW w:type="dxa" w:w="9936"/>
         <w:tblBorders>
           <w:top w:val="single" w:color="a12622" w:sz="6"/>
           <w:left w:val="single" w:color="a12622" w:sz="6"/>
@@ -923,11 +924,12 @@
         </w:tblBorders>
       </w:tblPr>
       <w:tblGrid>
-        <w:gridCol w:w="100"/>
+        <w:gridCol w:w="9936"/>
       </w:tblGrid>
       <w:tr>
         <w:tc>
           <w:tcPr>
+            <w:tcW w:type="dxa" w:w="9936"/>
             <w:shd w:fill="fdecea" w:val="clear"/>
             <w:tcMar>
               <w:top w:type="dxa" w:w="200"/>
@@ -1503,7 +1505,7 @@
     </w:p>
     <w:tbl>
       <w:tblPr>
-        <w:tblW w:type="pct" w:w="100%"/>
+        <w:tblW w:type="dxa" w:w="9936"/>
         <w:tblBorders>
           <w:top w:val="single" w:color="33404f" w:sz="6"/>
           <w:left w:val="single" w:color="33404f" w:sz="6"/>
@@ -1514,11 +1516,12 @@
         </w:tblBorders>
       </w:tblPr>
       <w:tblGrid>
-        <w:gridCol w:w="100"/>
+        <w:gridCol w:w="9936"/>
       </w:tblGrid>
       <w:tr>
         <w:tc>
           <w:tcPr>
+            <w:tcW w:type="dxa" w:w="9936"/>
             <w:shd w:fill="eef1f6" w:val="clear"/>
             <w:tcMar>
               <w:top w:type="dxa" w:w="200"/>
@@ -1952,7 +1955,7 @@
     </w:p>
     <w:tbl>
       <w:tblPr>
-        <w:tblW w:type="pct" w:w="100%"/>
+        <w:tblW w:type="dxa" w:w="9936"/>
         <w:tblBorders>
           <w:top w:val="single" w:color="1e6b45" w:sz="4"/>
           <w:left w:val="single" w:color="1e6b45" w:sz="4"/>
@@ -1963,11 +1966,12 @@
         </w:tblBorders>
       </w:tblPr>
       <w:tblGrid>
-        <w:gridCol w:w="100"/>
+        <w:gridCol w:w="9936"/>
       </w:tblGrid>
       <w:tr>
         <w:tc>
           <w:tcPr>
+            <w:tcW w:type="dxa" w:w="9936"/>
             <w:shd w:fill="e7f3ec" w:val="clear"/>
             <w:tcMar>
               <w:top w:type="dxa" w:w="140"/>
@@ -2350,7 +2354,7 @@
     </w:p>
     <w:tbl>
       <w:tblPr>
-        <w:tblW w:type="pct" w:w="100%"/>
+        <w:tblW w:type="dxa" w:w="9936"/>
         <w:tblBorders>
           <w:top w:val="single" w:color="33404f" w:sz="6"/>
           <w:left w:val="single" w:color="33404f" w:sz="6"/>
@@ -2361,11 +2365,12 @@
         </w:tblBorders>
       </w:tblPr>
       <w:tblGrid>
-        <w:gridCol w:w="100"/>
+        <w:gridCol w:w="9936"/>
       </w:tblGrid>
       <w:tr>
         <w:tc>
           <w:tcPr>
+            <w:tcW w:type="dxa" w:w="9936"/>
             <w:shd w:fill="eef1f6" w:val="clear"/>
             <w:tcMar>
               <w:top w:type="dxa" w:w="200"/>
@@ -2416,7 +2421,7 @@
     </w:p>
     <w:tbl>
       <w:tblPr>
-        <w:tblW w:type="pct" w:w="100%"/>
+        <w:tblW w:type="dxa" w:w="9936"/>
         <w:tblBorders>
           <w:top w:val="single" w:color="a15c07" w:sz="4"/>
           <w:left w:val="single" w:color="a15c07" w:sz="4"/>
@@ -2427,11 +2432,12 @@
         </w:tblBorders>
       </w:tblPr>
       <w:tblGrid>
-        <w:gridCol w:w="100"/>
+        <w:gridCol w:w="9936"/>
       </w:tblGrid>
       <w:tr>
         <w:tc>
           <w:tcPr>
+            <w:tcW w:type="dxa" w:w="9936"/>
             <w:shd w:fill="fdf1e0" w:val="clear"/>
             <w:tcMar>
               <w:top w:type="dxa" w:w="140"/>
@@ -2474,7 +2480,7 @@
     </w:p>
     <w:tbl>
       <w:tblPr>
-        <w:tblW w:type="pct" w:w="100%"/>
+        <w:tblW w:type="dxa" w:w="9936"/>
         <w:tblBorders>
           <w:top w:val="single" w:color="a15c07" w:sz="6"/>
           <w:left w:val="single" w:color="a15c07" w:sz="6"/>
@@ -2485,11 +2491,12 @@
         </w:tblBorders>
       </w:tblPr>
       <w:tblGrid>
-        <w:gridCol w:w="100"/>
+        <w:gridCol w:w="9936"/>
       </w:tblGrid>
       <w:tr>
         <w:tc>
           <w:tcPr>
+            <w:tcW w:type="dxa" w:w="9936"/>
             <w:shd w:fill="fdf1e0" w:val="clear"/>
             <w:tcMar>
               <w:top w:type="dxa" w:w="200"/>
@@ -2830,7 +2837,7 @@
     </w:p>
     <w:tbl>
       <w:tblPr>
-        <w:tblW w:type="pct" w:w="100%"/>
+        <w:tblW w:type="dxa" w:w="9936"/>
         <w:tblBorders>
           <w:top w:val="single" w:color="a15c07" w:sz="4"/>
           <w:left w:val="single" w:color="a15c07" w:sz="4"/>
@@ -2841,11 +2848,12 @@
         </w:tblBorders>
       </w:tblPr>
       <w:tblGrid>
-        <w:gridCol w:w="100"/>
+        <w:gridCol w:w="9936"/>
       </w:tblGrid>
       <w:tr>
         <w:tc>
           <w:tcPr>
+            <w:tcW w:type="dxa" w:w="9936"/>
             <w:shd w:fill="fdf1e0" w:val="clear"/>
             <w:tcMar>
               <w:top w:type="dxa" w:w="140"/>
@@ -2996,7 +3004,7 @@
     </w:p>
     <w:tbl>
       <w:tblPr>
-        <w:tblW w:type="pct" w:w="100%"/>
+        <w:tblW w:type="dxa" w:w="9936"/>
         <w:tblBorders>
           <w:top w:val="single" w:color="33448f" w:sz="6"/>
           <w:left w:val="single" w:color="33448f" w:sz="6"/>
@@ -3007,11 +3015,12 @@
         </w:tblBorders>
       </w:tblPr>
       <w:tblGrid>
-        <w:gridCol w:w="100"/>
+        <w:gridCol w:w="9936"/>
       </w:tblGrid>
       <w:tr>
         <w:tc>
           <w:tcPr>
+            <w:tcW w:type="dxa" w:w="9936"/>
             <w:shd w:fill="eaeefb" w:val="clear"/>
             <w:tcMar>
               <w:top w:type="dxa" w:w="200"/>
@@ -3209,7 +3218,7 @@
     </w:p>
     <w:tbl>
       <w:tblPr>
-        <w:tblW w:type="pct" w:w="100%"/>
+        <w:tblW w:type="dxa" w:w="9936"/>
         <w:tblBorders>
           <w:top w:val="single" w:color="a15c07" w:sz="4"/>
           <w:left w:val="single" w:color="a15c07" w:sz="4"/>
@@ -3220,11 +3229,12 @@
         </w:tblBorders>
       </w:tblPr>
       <w:tblGrid>
-        <w:gridCol w:w="100"/>
+        <w:gridCol w:w="9936"/>
       </w:tblGrid>
       <w:tr>
         <w:tc>
           <w:tcPr>
+            <w:tcW w:type="dxa" w:w="9936"/>
             <w:shd w:fill="fdf1e0" w:val="clear"/>
             <w:tcMar>
               <w:top w:type="dxa" w:w="140"/>
@@ -3470,7 +3480,7 @@
     </w:p>
     <w:tbl>
       <w:tblPr>
-        <w:tblW w:type="pct" w:w="100%"/>
+        <w:tblW w:type="dxa" w:w="9936"/>
         <w:tblBorders>
           <w:top w:val="single" w:color="33404f" w:sz="6"/>
           <w:left w:val="single" w:color="33404f" w:sz="6"/>
@@ -3481,11 +3491,12 @@
         </w:tblBorders>
       </w:tblPr>
       <w:tblGrid>
-        <w:gridCol w:w="100"/>
+        <w:gridCol w:w="9936"/>
       </w:tblGrid>
       <w:tr>
         <w:tc>
           <w:tcPr>
+            <w:tcW w:type="dxa" w:w="9936"/>
             <w:shd w:fill="eef1f6" w:val="clear"/>
             <w:tcMar>
               <w:top w:type="dxa" w:w="200"/>
@@ -3618,7 +3629,7 @@
     </w:p>
     <w:tbl>
       <w:tblPr>
-        <w:tblW w:type="pct" w:w="100%"/>
+        <w:tblW w:type="dxa" w:w="9936"/>
         <w:tblBorders>
           <w:top w:val="single" w:color="a12622" w:sz="6"/>
           <w:left w:val="single" w:color="a12622" w:sz="6"/>
@@ -3629,11 +3640,12 @@
         </w:tblBorders>
       </w:tblPr>
       <w:tblGrid>
-        <w:gridCol w:w="100"/>
+        <w:gridCol w:w="9936"/>
       </w:tblGrid>
       <w:tr>
         <w:tc>
           <w:tcPr>
+            <w:tcW w:type="dxa" w:w="9936"/>
             <w:shd w:fill="fdecea" w:val="clear"/>
             <w:tcMar>
               <w:top w:type="dxa" w:w="200"/>
@@ -4382,7 +4394,7 @@
     </w:p>
     <w:tbl>
       <w:tblPr>
-        <w:tblW w:type="pct" w:w="100%"/>
+        <w:tblW w:type="dxa" w:w="9936"/>
         <w:tblBorders>
           <w:top w:val="single" w:color="33404f" w:sz="6"/>
           <w:left w:val="single" w:color="33404f" w:sz="6"/>
@@ -4393,11 +4405,12 @@
         </w:tblBorders>
       </w:tblPr>
       <w:tblGrid>
-        <w:gridCol w:w="100"/>
+        <w:gridCol w:w="9936"/>
       </w:tblGrid>
       <w:tr>
         <w:tc>
           <w:tcPr>
+            <w:tcW w:type="dxa" w:w="9936"/>
             <w:shd w:fill="eef1f6" w:val="clear"/>
             <w:tcMar>
               <w:top w:type="dxa" w:w="200"/>

</xml_diff>